<commit_message>
Thay bia theo mau + them trang Thong tin & Cam ket nop bai
- Cover page: TRUONG DH VAN HIEN, KHOA CNTT, BAO CAO TIEU LUAN CUOI KY
- TEN DE TAI: VAI TRO CUA GATEWAY TRONG BAO MAT IoT
- Them trang THONG TIN VA CAM KET NOP BAI sau bia
- Bo sung cam ket an toan va hoc thuat

Co-Authored-By: Claude <noreply@anthropic.com>
</commit_message>
<xml_diff>
--- a/report/LuongNguyenNgocDinh_baocaotieuluanlan03.docx
+++ b/report/LuongNguyenNgocDinh_baocaotieuluanlan03.docx
@@ -10,9 +10,10 @@
       <w:r>
         <w:rPr>
           <w:rFonts w:ascii="Times New Roman" w:hAnsi="Times New Roman"/>
+          <w:b/>
           <w:i w:val="0"/>
           <w:color w:val="000000"/>
-          <w:sz w:val="26"/>
+          <w:sz w:val="28"/>
         </w:rPr>
         <w:t>TRƯỜNG ĐẠI HỌC VĂN HIẾN</w:t>
       </w:r>
@@ -28,7 +29,7 @@
           <w:b/>
           <w:i w:val="0"/>
           <w:color w:val="000000"/>
-          <w:sz w:val="26"/>
+          <w:sz w:val="28"/>
         </w:rPr>
         <w:t>KHOA CÔNG NGHỆ THÔNG TIN</w:t>
       </w:r>
@@ -40,9 +41,10 @@
       <w:r>
         <w:rPr>
           <w:rFonts w:ascii="Times New Roman" w:hAnsi="Times New Roman"/>
+          <w:b/>
           <w:i w:val="0"/>
           <w:color w:val="000000"/>
-          <w:sz w:val="26"/>
+          <w:sz w:val="32"/>
         </w:rPr>
         <w:t>BÁO CÁO TIỂU LUẬN CUỐI KỲ</w:t>
       </w:r>
@@ -55,6 +57,7 @@
       <w:r>
         <w:rPr>
           <w:rFonts w:ascii="Times New Roman" w:hAnsi="Times New Roman"/>
+          <w:b w:val="0"/>
           <w:i w:val="0"/>
           <w:color w:val="000000"/>
           <w:sz w:val="26"/>
@@ -74,7 +77,7 @@
           <w:color w:val="000000"/>
           <w:sz w:val="26"/>
         </w:rPr>
-        <w:t>Sinh viên: Lương Nguyễn Ngọc Đinh | MSSV: 231A010001</w:t>
+        <w:t>TÊN ĐỀ TÀI:</w:t>
       </w:r>
     </w:p>
     <w:p>
@@ -85,9 +88,10 @@
       <w:r>
         <w:rPr>
           <w:rFonts w:ascii="Times New Roman" w:hAnsi="Times New Roman"/>
+          <w:b/>
           <w:i w:val="0"/>
           <w:color w:val="000000"/>
-          <w:sz w:val="26"/>
+          <w:sz w:val="32"/>
         </w:rPr>
         <w:t>VAI TRÒ CỦA GATEWAY TRONG BẢO MẬT IoT</w:t>
       </w:r>
@@ -560,16 +564,13 @@
       <w:r>
         <w:rPr>
           <w:rFonts w:cs="Times New Roman" w:ascii="Times New Roman" w:hAnsi="Times New Roman"/>
-          <w:b/>
+          <w:b w:val="0"/>
           <w:i w:val="0"/>
           <w:color w:val="000000"/>
           <w:sz w:val="26"/>
         </w:rPr>
         <w:t>TP. HỒ CHÍ MINH, 2026</w:t>
       </w:r>
-    </w:p>
-    <w:p/>
-    <w:p>
       <w:r>
         <w:rPr>
           <w:rFonts w:ascii="Times New Roman" w:hAnsi="Times New Roman"/>
@@ -578,6 +579,426 @@
           <w:sz w:val="26"/>
         </w:rPr>
         <w:br w:type="page"/>
+      </w:r>
+    </w:p>
+    <w:tbl>
+      <w:tblPr>
+        <w:tblW w:w="5000" w:type="pct"/>
+        <w:tblBorders>
+          <w:top w:val="single" w:sz="4" w:space="0" w:color="000000"/>
+          <w:left w:val="single" w:sz="4" w:space="0" w:color="000000"/>
+          <w:bottom w:val="single" w:sz="4" w:space="0" w:color="000000"/>
+          <w:right w:val="single" w:sz="4" w:space="0" w:color="000000"/>
+          <w:insideH w:val="single" w:sz="4" w:space="0" w:color="000000"/>
+          <w:insideV w:val="single" w:sz="4" w:space="0" w:color="000000"/>
+        </w:tblBorders>
+      </w:tblPr>
+      <w:tr>
+        <w:tc>
+          <w:tcPr>
+            <w:tcW w:w="2000" w:type="dxa"/>
+            <w:shd w:val="clear" w:color="auto" w:fill="003366"/>
+          </w:tcPr>
+          <w:p>
+            <w:pPr>
+              <w:jc w:val="left"/>
+            </w:pPr>
+            <w:r>
+              <w:rPr>
+                <w:rFonts w:ascii="Times New Roman" w:hAnsi="Times New Roman"/>
+                <w:b/>
+                <w:color w:val="FFFFFF"/>
+                <w:sz w:val="24"/>
+              </w:rPr>
+              <w:t xml:space="preserve">Mã đề tài</w:t>
+            </w:r>
+          </w:p>
+        </w:tc>
+        <w:tc>
+          <w:tcPr>
+            <w:tcW w:w="7000" w:type="dxa"/>
+            <w:shd w:val="clear" w:color="auto" w:fill="003366"/>
+          </w:tcPr>
+          <w:p>
+            <w:pPr>
+              <w:jc w:val="left"/>
+            </w:pPr>
+            <w:r>
+              <w:rPr>
+                <w:rFonts w:ascii="Times New Roman" w:hAnsi="Times New Roman"/>
+                <w:color w:val="FFFFFF"/>
+                <w:sz w:val="24"/>
+              </w:rPr>
+              <w:t xml:space="preserve">04</w:t>
+            </w:r>
+          </w:p>
+        </w:tc>
+      </w:tr>
+      <w:tr>
+        <w:tc>
+          <w:tcPr>
+            <w:tcW w:w="2000" w:type="dxa"/>
+            <w:shd w:val="clear" w:color="auto" w:fill="FFFFFF"/>
+          </w:tcPr>
+          <w:p>
+            <w:pPr>
+              <w:jc w:val="left"/>
+            </w:pPr>
+            <w:r>
+              <w:rPr>
+                <w:rFonts w:ascii="Times New Roman" w:hAnsi="Times New Roman"/>
+                <w:b/>
+                <w:color w:val="000000"/>
+                <w:sz w:val="24"/>
+              </w:rPr>
+              <w:t xml:space="preserve">Hướng đề tài</w:t>
+            </w:r>
+          </w:p>
+        </w:tc>
+        <w:tc>
+          <w:tcPr>
+            <w:tcW w:w="7000" w:type="dxa"/>
+            <w:shd w:val="clear" w:color="auto" w:fill="FFFFFF"/>
+          </w:tcPr>
+          <w:p>
+            <w:pPr>
+              <w:jc w:val="left"/>
+            </w:pPr>
+            <w:r>
+              <w:rPr>
+                <w:rFonts w:ascii="Times New Roman" w:hAnsi="Times New Roman"/>
+                <w:color w:val="000000"/>
+                <w:sz w:val="24"/>
+              </w:rPr>
+              <w:t xml:space="preserve">A (Kiến trúc, ứng dụng và đánh giá tổng thể)</w:t>
+            </w:r>
+          </w:p>
+        </w:tc>
+      </w:tr>
+      <w:tr>
+        <w:tc>
+          <w:tcPr>
+            <w:tcW w:w="2000" w:type="dxa"/>
+            <w:shd w:val="clear" w:color="auto" w:fill="F2F2F2"/>
+          </w:tcPr>
+          <w:p>
+            <w:pPr>
+              <w:jc w:val="left"/>
+            </w:pPr>
+            <w:r>
+              <w:rPr>
+                <w:rFonts w:ascii="Times New Roman" w:hAnsi="Times New Roman"/>
+                <w:b/>
+                <w:color w:val="000000"/>
+                <w:sz w:val="24"/>
+              </w:rPr>
+              <w:t xml:space="preserve">Sinh viên thực hiện</w:t>
+            </w:r>
+          </w:p>
+        </w:tc>
+        <w:tc>
+          <w:tcPr>
+            <w:tcW w:w="7000" w:type="dxa"/>
+            <w:shd w:val="clear" w:color="auto" w:fill="F2F2F2"/>
+          </w:tcPr>
+          <w:p>
+            <w:pPr>
+              <w:jc w:val="left"/>
+            </w:pPr>
+            <w:r>
+              <w:rPr>
+                <w:rFonts w:ascii="Times New Roman" w:hAnsi="Times New Roman"/>
+                <w:color w:val="000000"/>
+                <w:sz w:val="24"/>
+              </w:rPr>
+              <w:t xml:space="preserve">Lương Nguyễn Ngọc Đinh</w:t>
+            </w:r>
+          </w:p>
+        </w:tc>
+      </w:tr>
+      <w:tr>
+        <w:tc>
+          <w:tcPr>
+            <w:tcW w:w="2000" w:type="dxa"/>
+            <w:shd w:val="clear" w:color="auto" w:fill="FFFFFF"/>
+          </w:tcPr>
+          <w:p>
+            <w:pPr>
+              <w:jc w:val="left"/>
+            </w:pPr>
+            <w:r>
+              <w:rPr>
+                <w:rFonts w:ascii="Times New Roman" w:hAnsi="Times New Roman"/>
+                <w:b/>
+                <w:color w:val="000000"/>
+                <w:sz w:val="24"/>
+              </w:rPr>
+              <w:t xml:space="preserve">Mã số sinh viên</w:t>
+            </w:r>
+          </w:p>
+        </w:tc>
+        <w:tc>
+          <w:tcPr>
+            <w:tcW w:w="7000" w:type="dxa"/>
+            <w:shd w:val="clear" w:color="auto" w:fill="FFFFFF"/>
+          </w:tcPr>
+          <w:p>
+            <w:pPr>
+              <w:jc w:val="left"/>
+            </w:pPr>
+            <w:r>
+              <w:rPr>
+                <w:rFonts w:ascii="Times New Roman" w:hAnsi="Times New Roman"/>
+                <w:color w:val="000000"/>
+                <w:sz w:val="24"/>
+              </w:rPr>
+              <w:t xml:space="preserve">231A010001</w:t>
+            </w:r>
+          </w:p>
+        </w:tc>
+      </w:tr>
+      <w:tr>
+        <w:tc>
+          <w:tcPr>
+            <w:tcW w:w="2000" w:type="dxa"/>
+            <w:shd w:val="clear" w:color="auto" w:fill="F2F2F2"/>
+          </w:tcPr>
+          <w:p>
+            <w:pPr>
+              <w:jc w:val="left"/>
+            </w:pPr>
+            <w:r>
+              <w:rPr>
+                <w:rFonts w:ascii="Times New Roman" w:hAnsi="Times New Roman"/>
+                <w:b/>
+                <w:color w:val="000000"/>
+                <w:sz w:val="24"/>
+              </w:rPr>
+              <w:t xml:space="preserve">Lớp học phần</w:t>
+            </w:r>
+          </w:p>
+        </w:tc>
+        <w:tc>
+          <w:tcPr>
+            <w:tcW w:w="7000" w:type="dxa"/>
+            <w:shd w:val="clear" w:color="auto" w:fill="F2F2F2"/>
+          </w:tcPr>
+          <w:p>
+            <w:pPr>
+              <w:jc w:val="left"/>
+            </w:pPr>
+            <w:r>
+              <w:rPr>
+                <w:rFonts w:ascii="Times New Roman" w:hAnsi="Times New Roman"/>
+                <w:color w:val="000000"/>
+                <w:sz w:val="24"/>
+              </w:rPr>
+              <w:t xml:space="preserve">INT4410 - Bảo mật trong IoT</w:t>
+            </w:r>
+          </w:p>
+        </w:tc>
+      </w:tr>
+      <w:tr>
+        <w:tc>
+          <w:tcPr>
+            <w:tcW w:w="2000" w:type="dxa"/>
+            <w:shd w:val="clear" w:color="auto" w:fill="FFFFFF"/>
+          </w:tcPr>
+          <w:p>
+            <w:pPr>
+              <w:jc w:val="left"/>
+            </w:pPr>
+            <w:r>
+              <w:rPr>
+                <w:rFonts w:ascii="Times New Roman" w:hAnsi="Times New Roman"/>
+                <w:b/>
+                <w:color w:val="000000"/>
+                <w:sz w:val="24"/>
+              </w:rPr>
+              <w:t xml:space="preserve">Giảng viên hướng dẫn</w:t>
+            </w:r>
+          </w:p>
+        </w:tc>
+        <w:tc>
+          <w:tcPr>
+            <w:tcW w:w="7000" w:type="dxa"/>
+            <w:shd w:val="clear" w:color="auto" w:fill="FFFFFF"/>
+          </w:tcPr>
+          <w:p>
+            <w:pPr>
+              <w:jc w:val="left"/>
+            </w:pPr>
+            <w:r>
+              <w:rPr>
+                <w:rFonts w:ascii="Times New Roman" w:hAnsi="Times New Roman"/>
+                <w:color w:val="000000"/>
+                <w:sz w:val="24"/>
+              </w:rPr>
+              <w:t xml:space="preserve">Hồ Nhựt Minh</w:t>
+            </w:r>
+          </w:p>
+        </w:tc>
+      </w:tr>
+      <w:tr>
+        <w:tc>
+          <w:tcPr>
+            <w:tcW w:w="2000" w:type="dxa"/>
+            <w:shd w:val="clear" w:color="auto" w:fill="F2F2F2"/>
+          </w:tcPr>
+          <w:p>
+            <w:pPr>
+              <w:jc w:val="left"/>
+            </w:pPr>
+            <w:r>
+              <w:rPr>
+                <w:rFonts w:ascii="Times New Roman" w:hAnsi="Times New Roman"/>
+                <w:b/>
+                <w:color w:val="000000"/>
+                <w:sz w:val="24"/>
+              </w:rPr>
+              <w:t xml:space="preserve">Link repository GitHub</w:t>
+            </w:r>
+          </w:p>
+        </w:tc>
+        <w:tc>
+          <w:tcPr>
+            <w:tcW w:w="7000" w:type="dxa"/>
+            <w:shd w:val="clear" w:color="auto" w:fill="F2F2F2"/>
+          </w:tcPr>
+          <w:p>
+            <w:pPr>
+              <w:jc w:val="left"/>
+            </w:pPr>
+            <w:r>
+              <w:rPr>
+                <w:rFonts w:ascii="Times New Roman" w:hAnsi="Times New Roman"/>
+                <w:color w:val="000000"/>
+                <w:sz w:val="24"/>
+              </w:rPr>
+              <w:t xml:space="preserve">https://github.com/dinhvaren/iot-gateway-security-lab</w:t>
+            </w:r>
+          </w:p>
+        </w:tc>
+      </w:tr>
+      <w:tr>
+        <w:tc>
+          <w:tcPr>
+            <w:tcW w:w="2000" w:type="dxa"/>
+            <w:shd w:val="clear" w:color="auto" w:fill="FFFFFF"/>
+          </w:tcPr>
+          <w:p>
+            <w:pPr>
+              <w:jc w:val="left"/>
+            </w:pPr>
+            <w:r>
+              <w:rPr>
+                <w:rFonts w:ascii="Times New Roman" w:hAnsi="Times New Roman"/>
+                <w:b/>
+                <w:color w:val="000000"/>
+                <w:sz w:val="24"/>
+              </w:rPr>
+              <w:t xml:space="preserve">Ngày nộp</w:t>
+            </w:r>
+          </w:p>
+        </w:tc>
+        <w:tc>
+          <w:tcPr>
+            <w:tcW w:w="7000" w:type="dxa"/>
+            <w:shd w:val="clear" w:color="auto" w:fill="FFFFFF"/>
+          </w:tcPr>
+          <w:p>
+            <w:pPr>
+              <w:jc w:val="left"/>
+            </w:pPr>
+            <w:r>
+              <w:rPr>
+                <w:rFonts w:ascii="Times New Roman" w:hAnsi="Times New Roman"/>
+                <w:color w:val="000000"/>
+                <w:sz w:val="24"/>
+              </w:rPr>
+              <w:t xml:space="preserve">23/07/2026</w:t>
+            </w:r>
+          </w:p>
+        </w:tc>
+      </w:tr>
+    </w:tbl>
+    <w:p>
+      <w:r>
+        <w:br w:type="page"/>
+      </w:r>
+    </w:p>
+    <w:p>
+      <w:pPr>
+        <w:pStyle w:val="Heading1"/>
+      </w:pPr>
+      <w:r>
+        <w:rPr>
+          <w:rFonts w:ascii="Times New Roman" w:hAnsi="Times New Roman"/>
+          <w:sz w:val="32"/>
+        </w:rPr>
+        <w:t xml:space="preserve">THÔNG TIN VÀ CAM KẾT NỘP BÀI</w:t>
+      </w:r>
+    </w:p>
+    <w:p/>
+    <w:p>
+      <w:pPr>
+        <w:pStyle w:val="Heading2"/>
+      </w:pPr>
+      <w:r>
+        <w:rPr>
+          <w:rFonts w:ascii="Times New Roman" w:hAnsi="Times New Roman"/>
+          <w:sz w:val="28"/>
+        </w:rPr>
+        <w:t xml:space="preserve">Cam kết an toàn và học thuật</w:t>
+      </w:r>
+    </w:p>
+    <w:p>
+      <w:pPr>
+        <w:jc w:val="both"/>
+      </w:pPr>
+      <w:r>
+        <w:rPr>
+          <w:rFonts w:ascii="Times New Roman" w:hAnsi="Times New Roman"/>
+          <w:sz w:val="26"/>
+        </w:rPr>
+        <w:t xml:space="preserve">Tôi cam kết toàn bộ thử nghiệm được thực hiện trong môi trường cục bộ, thiết bị thuộc quyền sở hữu hoặc dữ liệu giả lập; không quét, khai thác hay thu thập dữ liệu từ hệ thống thật khi chưa được phép. Toàn bộ mã nguồn, cấu hình và tài liệu trong repository GitHub là sản phẩm do tôi trực tiếp thực hiện, có tham khảo các nguồn được trích dẫn đầy đủ trong Tài liệu tham khảo.</w:t>
+      </w:r>
+    </w:p>
+    <w:p/>
+    <w:p>
+      <w:pPr>
+        <w:jc w:val="left"/>
+      </w:pPr>
+      <w:r>
+        <w:rPr>
+          <w:rFonts w:ascii="Times New Roman" w:hAnsi="Times New Roman"/>
+          <w:sz w:val="26"/>
+        </w:rPr>
+        <w:t xml:space="preserve">Họ tên người cam kết: Lương Nguyễn Ngọc Đinh</w:t>
+      </w:r>
+    </w:p>
+    <w:p>
+      <w:pPr>
+        <w:jc w:val="left"/>
+      </w:pPr>
+      <w:r>
+        <w:rPr>
+          <w:rFonts w:ascii="Times New Roman" w:hAnsi="Times New Roman"/>
+          <w:sz w:val="26"/>
+        </w:rPr>
+        <w:t xml:space="preserve">Ngày cam kết: 23/07/2026</w:t>
+      </w:r>
+    </w:p>
+    <w:p>
+      <w:pPr>
+        <w:jc w:val="left"/>
+      </w:pPr>
+      <w:r>
+        <w:rPr>
+          <w:rFonts w:ascii="Times New Roman" w:hAnsi="Times New Roman"/>
+          <w:sz w:val="26"/>
+        </w:rPr>
+        <w:t xml:space="preserve">Chữ ký: [........................................................]</w:t>
       </w:r>
     </w:p>
     <w:p>

</xml_diff>

<commit_message>
Xoa empty heading con sot
</commit_message>
<xml_diff>
--- a/report/LuongNguyenNgocDinh_baocaotieuluanlan03.docx
+++ b/report/LuongNguyenNgocDinh_baocaotieuluanlan03.docx
@@ -16530,14 +16530,6 @@
         </w:tc>
       </w:tr>
     </w:tbl>
-    <w:p>
-      <w:pPr>
-        <w:pStyle w:val="Heading1"/>
-        <w:rPr>
-          <w:rFonts w:ascii="Times New Roman" w:hAnsi="Times New Roman"/>
-        </w:rPr>
-      </w:pPr>
-    </w:p>
     <w:p>
       <w:pPr>
         <w:spacing w:after="200" w:line="276" w:lineRule="auto"/>

</xml_diff>